<commit_message>
fix(certificates): limpiar texto instructivo en rojo y reemplazar con etiqueta parametrizada [INICIALES] en plantilla de constancia laboral 011
</commit_message>
<xml_diff>
--- a/core-humanis-app/template/plantilla-constancia-laboral.docx
+++ b/core-humanis-app/template/plantilla-constancia-laboral.docx
@@ -53,309 +53,7 @@
           <w:sz w:val="22"/>
           <w:szCs w:val="22"/>
         </w:rPr>
-        <w:t>SCSP/URH/[CORRELATIVO]-[AÑO]/IR-</w:t>
-      </w:r>
-      <w:proofErr w:type="spellStart"/>
-      <w:r>
-        <w:rPr>
-          <w:rFonts w:ascii="Altivo Light" w:hAnsi="Altivo Light" w:cstheme="majorHAnsi"/>
-          <w:b/>
-          <w:sz w:val="22"/>
-          <w:szCs w:val="22"/>
-        </w:rPr>
-        <w:t>jpcp</w:t>
-      </w:r>
-      <w:proofErr w:type="spellEnd"/>
-      <w:r>
-        <w:rPr>
-          <w:rFonts w:ascii="Altivo Light" w:hAnsi="Altivo Light" w:cstheme="majorHAnsi"/>
-          <w:b/>
-          <w:sz w:val="22"/>
-          <w:szCs w:val="22"/>
-        </w:rPr>
-        <w:t xml:space="preserve"> </w:t>
-      </w:r>
-      <w:r>
-        <w:rPr>
-          <w:rFonts w:ascii="Altivo Light" w:hAnsi="Altivo Light" w:cstheme="majorHAnsi"/>
-          <w:b/>
-          <w:color w:val="EE0000"/>
-          <w:sz w:val="22"/>
-          <w:szCs w:val="22"/>
-        </w:rPr>
-        <w:t>(iniciales de: jefatura URH / Quien lo elabora)</w:t>
-      </w:r>
-    </w:p>
-    <w:p>
-      <w:pPr>
-        <w:jc w:val="both"/>
-        <w:rPr>
-          <w:rFonts w:ascii="Altivo Light" w:hAnsi="Altivo Light" w:cs="Arial"/>
-          <w:sz w:val="22"/>
-          <w:szCs w:val="22"/>
-        </w:rPr>
-      </w:pPr>
-    </w:p>
-    <w:p>
-      <w:pPr>
-        <w:jc w:val="center"/>
-        <w:rPr>
-          <w:rFonts w:ascii="Altivo Light" w:hAnsi="Altivo Light" w:cs="Arial"/>
-          <w:b/>
-          <w:bCs/>
-          <w:sz w:val="22"/>
-          <w:szCs w:val="22"/>
-        </w:rPr>
-      </w:pPr>
-      <w:r>
-        <w:rPr>
-          <w:rFonts w:ascii="Altivo Light" w:hAnsi="Altivo Light" w:cs="Arial"/>
-          <w:b/>
-          <w:bCs/>
-          <w:sz w:val="22"/>
-          <w:szCs w:val="22"/>
-        </w:rPr>
-        <w:t>CONSTANCIA LABORAL</w:t>
-      </w:r>
-    </w:p>
-    <w:p>
-      <w:pPr>
-        <w:jc w:val="both"/>
-        <w:rPr>
-          <w:rFonts w:ascii="Altivo Light" w:hAnsi="Altivo Light" w:cs="Arial"/>
-          <w:sz w:val="22"/>
-          <w:szCs w:val="22"/>
-        </w:rPr>
-      </w:pPr>
-    </w:p>
-    <w:p>
-      <w:pPr>
-        <w:spacing w:line="276" w:lineRule="auto"/>
-        <w:jc w:val="both"/>
-        <w:rPr>
-          <w:rFonts w:ascii="Altivo Light" w:hAnsi="Altivo Light" w:cstheme="majorHAnsi"/>
-          <w:sz w:val="22"/>
-          <w:szCs w:val="22"/>
-        </w:rPr>
-      </w:pPr>
-      <w:r>
-        <w:rPr>
-          <w:rFonts w:ascii="Altivo Light" w:hAnsi="Altivo Light" w:cstheme="majorHAnsi"/>
-          <w:sz w:val="22"/>
-          <w:szCs w:val="22"/>
-        </w:rPr>
-        <w:t>El infrascrito Analista de Monitoreo de Personal de la Unidad de Recursos Humanos de la Secretaría de Comunicación Social de la Presidencia.</w:t>
-      </w:r>
-    </w:p>
-    <w:p>
-      <w:pPr>
-        <w:jc w:val="both"/>
-        <w:rPr>
-          <w:rFonts w:asciiTheme="majorHAnsi" w:hAnsiTheme="majorHAnsi" w:cstheme="majorHAnsi"/>
-          <w:sz w:val="22"/>
-          <w:szCs w:val="22"/>
-        </w:rPr>
-      </w:pPr>
-    </w:p>
-    <w:p>
-      <w:pPr>
-        <w:jc w:val="center"/>
-        <w:rPr>
-          <w:rFonts w:ascii="Altivo Light" w:hAnsi="Altivo Light" w:cstheme="majorHAnsi"/>
-          <w:b/>
-          <w:sz w:val="22"/>
-          <w:szCs w:val="22"/>
-        </w:rPr>
-      </w:pPr>
-      <w:r>
-        <w:rPr>
-          <w:rFonts w:ascii="Altivo Light" w:hAnsi="Altivo Light" w:cstheme="majorHAnsi"/>
-          <w:b/>
-          <w:sz w:val="22"/>
-          <w:szCs w:val="22"/>
-        </w:rPr>
-        <w:t>CERTIFICA</w:t>
-      </w:r>
-    </w:p>
-    <w:p>
-      <w:pPr>
-        <w:jc w:val="center"/>
-        <w:rPr>
-          <w:rFonts w:ascii="Altivo Light" w:hAnsi="Altivo Light" w:cstheme="majorHAnsi"/>
-          <w:b/>
-          <w:sz w:val="22"/>
-          <w:szCs w:val="22"/>
-        </w:rPr>
-      </w:pPr>
-    </w:p>
-    <w:p>
-      <w:pPr>
-        <w:spacing w:line="276" w:lineRule="auto"/>
-        <w:jc w:val="both"/>
-        <w:rPr>
-          <w:rFonts w:ascii="Altivo Light" w:hAnsi="Altivo Light" w:cstheme="majorHAnsi"/>
-          <w:sz w:val="22"/>
-          <w:szCs w:val="22"/>
-        </w:rPr>
-      </w:pPr>
-      <w:r>
-        <w:rPr>
-          <w:rFonts w:ascii="Altivo Light" w:hAnsi="Altivo Light" w:cstheme="majorHAnsi"/>
-          <w:b/>
-          <w:sz w:val="22"/>
-          <w:szCs w:val="22"/>
-          <w:u w:val="single"/>
-        </w:rPr>
-        <w:t>PRIMERO</w:t>
-      </w:r>
-      <w:r>
-        <w:rPr>
-          <w:rFonts w:ascii="Altivo Light" w:hAnsi="Altivo Light" w:cstheme="majorHAnsi"/>
-          <w:sz w:val="22"/>
-          <w:szCs w:val="22"/>
-        </w:rPr>
-        <w:t xml:space="preserve">: </w:t>
-      </w:r>
-      <w:r>
-        <w:rPr>
-          <w:rFonts w:ascii="Altivo Light" w:hAnsi="Altivo Light" w:cs="Arial"/>
-          <w:sz w:val="22"/>
-          <w:szCs w:val="22"/>
-        </w:rPr>
-        <w:t xml:space="preserve">Que se ha tenido a la vista la Nómina General de Salarios del Sistema de Nómina, Registro de Servicios Personales, Estudios y/o Servicios Individuales y Otros Relacionados con el Recurso Humano -Guatenóminas- y el expediente </w:t>
-      </w:r>
-      <w:bookmarkStart w:id="0" w:name="_Hlk196232496"/>
-      <w:r>
-        <w:rPr>
-          <w:rFonts w:ascii="Altivo Light" w:hAnsi="Altivo Light" w:cstheme="majorHAnsi"/>
-          <w:sz w:val="22"/>
-          <w:szCs w:val="22"/>
-        </w:rPr>
-        <w:t>del [señor/señora] [NOMBRE COMPLETO]</w:t>
-      </w:r>
-      <w:r>
-        <w:rPr>
-          <w:rFonts w:ascii="Altivo Light" w:hAnsi="Altivo Light" w:cstheme="majorHAnsi"/>
-          <w:b/>
-          <w:bCs/>
-          <w:sz w:val="22"/>
-          <w:szCs w:val="22"/>
-        </w:rPr>
-        <w:t xml:space="preserve">, </w:t>
-      </w:r>
-      <w:bookmarkEnd w:id="0"/>
-      <w:r>
-        <w:rPr>
-          <w:rFonts w:ascii="Altivo Light" w:hAnsi="Altivo Light" w:cstheme="majorHAnsi"/>
-          <w:sz w:val="22"/>
-          <w:szCs w:val="22"/>
-        </w:rPr>
-        <w:t xml:space="preserve">quien se identifica con Documento Personal de Identificación -DPI- con Código Único de Identificación -CUI- [CUI]. </w:t>
-      </w:r>
-    </w:p>
-    <w:p>
-      <w:pPr>
-        <w:jc w:val="both"/>
-        <w:rPr>
-          <w:rFonts w:ascii="Altivo Light" w:hAnsi="Altivo Light" w:cs="Arial"/>
-          <w:sz w:val="22"/>
-          <w:szCs w:val="22"/>
-        </w:rPr>
-      </w:pPr>
-    </w:p>
-    <w:p>
-      <w:pPr>
-        <w:spacing w:line="276" w:lineRule="auto"/>
-        <w:jc w:val="both"/>
-        <w:rPr>
-          <w:rFonts w:ascii="Altivo Light" w:hAnsi="Altivo Light" w:cstheme="majorHAnsi"/>
-          <w:sz w:val="22"/>
-          <w:szCs w:val="22"/>
-        </w:rPr>
-      </w:pPr>
-      <w:r>
-        <w:rPr>
-          <w:rFonts w:ascii="Altivo Light" w:hAnsi="Altivo Light" w:cstheme="majorHAnsi"/>
-          <w:b/>
-          <w:sz w:val="22"/>
-          <w:szCs w:val="22"/>
-          <w:u w:val="single"/>
-        </w:rPr>
-        <w:t>SEGUNDO</w:t>
-      </w:r>
-      <w:r>
-        <w:rPr>
-          <w:rFonts w:ascii="Altivo Light" w:hAnsi="Altivo Light" w:cstheme="majorHAnsi"/>
-          <w:sz w:val="22"/>
-          <w:szCs w:val="22"/>
-        </w:rPr>
-        <w:t>: [E</w:t>
-      </w:r>
-      <w:r>
-        <w:rPr>
-          <w:rFonts w:ascii="Altivo Light" w:hAnsi="Altivo Light" w:cstheme="majorHAnsi"/>
-          <w:sz w:val="22"/>
-          <w:szCs w:val="22"/>
-        </w:rPr>
-        <w:t>l</w:t>
-      </w:r>
-      <w:r>
-        <w:rPr>
-          <w:rFonts w:ascii="Altivo Light" w:hAnsi="Altivo Light" w:cstheme="majorHAnsi"/>
-          <w:sz w:val="22"/>
-          <w:szCs w:val="22"/>
-        </w:rPr>
-        <w:t>/L</w:t>
-      </w:r>
-      <w:r>
-        <w:rPr>
-          <w:rFonts w:ascii="Altivo Light" w:hAnsi="Altivo Light" w:cstheme="majorHAnsi"/>
-          <w:sz w:val="22"/>
-          <w:szCs w:val="22"/>
-        </w:rPr>
-        <w:t>a</w:t>
-      </w:r>
-      <w:r>
-        <w:rPr>
-          <w:rFonts w:ascii="Altivo Light" w:hAnsi="Altivo Light" w:cstheme="majorHAnsi"/>
-          <w:sz w:val="22"/>
-          <w:szCs w:val="22"/>
-        </w:rPr>
-        <w:t>] [señor/señora</w:t>
-      </w:r>
-      <w:r>
-        <w:rPr>
-          <w:rFonts w:ascii="Altivo Light" w:hAnsi="Altivo Light" w:cstheme="majorHAnsi"/>
-          <w:sz w:val="22"/>
-          <w:szCs w:val="22"/>
-        </w:rPr>
-        <w:t>/Licenciado/Licenciada</w:t>
-      </w:r>
-      <w:r>
-        <w:rPr>
-          <w:rFonts w:ascii="Altivo Light" w:hAnsi="Altivo Light" w:cstheme="majorHAnsi"/>
-          <w:sz w:val="22"/>
-          <w:szCs w:val="22"/>
-        </w:rPr>
-        <w:t>]</w:t>
-      </w:r>
-      <w:r>
-        <w:rPr>
-          <w:rFonts w:ascii="Altivo Light" w:hAnsi="Altivo Light" w:cstheme="majorHAnsi"/>
-          <w:b/>
-          <w:bCs/>
-          <w:sz w:val="22"/>
-          <w:szCs w:val="22"/>
-        </w:rPr>
-        <w:t xml:space="preserve"> [NOMBRE COMPLETO], </w:t>
-      </w:r>
-      <w:r>
-        <w:rPr>
-          <w:rFonts w:ascii="Altivo Light" w:hAnsi="Altivo Light" w:cstheme="majorHAnsi"/>
-          <w:sz w:val="22"/>
-          <w:szCs w:val="22"/>
-        </w:rPr>
-        <w:t xml:space="preserve">labora en esta Secretaría a partir del [DÍA EN LETRAS] ([DD]) de [MES] del año [AÑO EN LETRAS] ([AAAA]), ocupando actualmente el puesto nominal de </w:t>
+        <w:t>SCSP/URH/[CORRELATIVO]-[AÑO]/[INICIALES] de [MES] del año [AÑO EN LETRAS] ([AAAA]), ocupando actualmente el puesto nominal de </w:t>
       </w:r>
       <w:r>
         <w:rPr>

</xml_diff>

<commit_message>
fix(certificates): format constancia laboral 011 template matching official layout
- Unify paragraph SEGUNDO text structure to single-block salary presentation
- Fix OpenXML text run fragmentation and proofErr tags in document.xml
- Update plantilla-constancia-laboral.docx template in core-humanis-app
</commit_message>
<xml_diff>
--- a/core-humanis-app/template/plantilla-constancia-laboral.docx
+++ b/core-humanis-app/template/plantilla-constancia-laboral.docx
@@ -13,150 +13,628 @@
           <w:szCs w:val="22"/>
         </w:rPr>
       </w:pPr>
-    </w:p>
-    <w:p>
-      <w:pPr>
-        <w:spacing w:line="276" w:lineRule="auto"/>
-        <w:ind w:left="7371"/>
+      <w:r>
         <w:rPr>
           <w:rFonts w:ascii="Altivo Light" w:hAnsi="Altivo Light" w:cstheme="majorHAnsi"/>
           <w:b/>
           <w:sz w:val="22"/>
           <w:szCs w:val="22"/>
         </w:rPr>
-      </w:pPr>
-      <w:r>
+        <w:t>Constancia</w:t>
+      </w:r>
+    </w:p>
+    <w:p>
+      <w:pPr>
+        <w:spacing w:line="276" w:lineRule="auto"/>
+        <w:jc w:val="right"/>
         <w:rPr>
           <w:rFonts w:ascii="Altivo Light" w:hAnsi="Altivo Light" w:cstheme="majorHAnsi"/>
           <w:b/>
           <w:sz w:val="22"/>
           <w:szCs w:val="22"/>
         </w:rPr>
-        <w:t>Constancia</w:t>
-      </w:r>
-    </w:p>
-    <w:p>
-      <w:pPr>
-        <w:spacing w:line="276" w:lineRule="auto"/>
-        <w:jc w:val="right"/>
+      </w:pPr>
+      <w:r>
         <w:rPr>
           <w:rFonts w:ascii="Altivo Light" w:hAnsi="Altivo Light" w:cstheme="majorHAnsi"/>
           <w:b/>
           <w:sz w:val="22"/>
           <w:szCs w:val="22"/>
         </w:rPr>
-      </w:pPr>
-      <w:r>
-        <w:rPr>
-          <w:rFonts w:ascii="Altivo Light" w:hAnsi="Altivo Light" w:cstheme="majorHAnsi"/>
+        <w:t>SCSP/URH/[CORRELATIVO]-[AÑO]/[INICIALES]</w:t>
+      </w:r>
+    </w:p>
+    <w:p>
+      <w:pPr>
+        <w:jc w:val="both"/>
+        <w:rPr>
+          <w:rFonts w:ascii="Altivo Light" w:hAnsi="Altivo Light" w:cs="Arial"/>
+          <w:sz w:val="32"/>
+          <w:szCs w:val="44"/>
+        </w:rPr>
+      </w:pPr>
+    </w:p>
+    <w:p>
+      <w:pPr>
+        <w:jc w:val="center"/>
+        <w:rPr>
+          <w:rFonts w:ascii="Altivo Light" w:hAnsi="Altivo Light" w:cs="Arial"/>
           <w:b/>
+          <w:bCs/>
+          <w:sz w:val="20"/>
+          <w:szCs w:val="20"/>
+        </w:rPr>
+      </w:pPr>
+      <w:r>
+        <w:rPr>
+          <w:rFonts w:ascii="Altivo Light" w:hAnsi="Altivo Light" w:cs="Arial"/>
+          <w:b/>
+          <w:bCs/>
+          <w:sz w:val="20"/>
+          <w:szCs w:val="20"/>
+        </w:rPr>
+        <w:t>CONSTANCIA LABORAL</w:t>
+      </w:r>
+    </w:p>
+    <w:p>
+      <w:pPr>
+        <w:jc w:val="both"/>
+        <w:rPr>
+          <w:rFonts w:ascii="Altivo Light" w:hAnsi="Altivo Light" w:cs="Arial"/>
+          <w:sz w:val="20"/>
+          <w:szCs w:val="20"/>
+        </w:rPr>
+      </w:pPr>
+    </w:p>
+    <w:p>
+      <w:pPr>
+        <w:spacing w:line="276" w:lineRule="auto"/>
+        <w:jc w:val="both"/>
+        <w:rPr>
+          <w:rFonts w:ascii="Altivo Light" w:hAnsi="Altivo Light" w:cstheme="majorHAnsi"/>
+          <w:sz w:val="20"/>
+          <w:szCs w:val="20"/>
+        </w:rPr>
+      </w:pPr>
+      <w:r>
+        <w:rPr>
+          <w:rFonts w:ascii="Altivo Light" w:hAnsi="Altivo Light" w:cstheme="majorHAnsi"/>
+          <w:sz w:val="20"/>
+          <w:szCs w:val="20"/>
+        </w:rPr>
+        <w:t>El infrascrito A</w:t>
+      </w:r>
+      <w:r>
+        <w:rPr>
+          <w:rFonts w:ascii="Altivo Light" w:hAnsi="Altivo Light" w:cstheme="majorHAnsi"/>
+          <w:sz w:val="20"/>
+          <w:szCs w:val="20"/>
+        </w:rPr>
+        <w:t>nalista</w:t>
+      </w:r>
+      <w:r>
+        <w:rPr>
+          <w:rFonts w:ascii="Altivo Light" w:hAnsi="Altivo Light" w:cstheme="majorHAnsi"/>
+          <w:sz w:val="20"/>
+          <w:szCs w:val="20"/>
+        </w:rPr>
+        <w:t xml:space="preserve"> de Monitoreo </w:t>
+      </w:r>
+      <w:r>
+        <w:rPr>
+          <w:rFonts w:ascii="Altivo Light" w:hAnsi="Altivo Light" w:cstheme="majorHAnsi"/>
+          <w:sz w:val="20"/>
+          <w:szCs w:val="20"/>
+        </w:rPr>
+        <w:t>de Personal</w:t>
+      </w:r>
+      <w:r>
+        <w:rPr>
+          <w:rFonts w:ascii="Altivo Light" w:hAnsi="Altivo Light" w:cstheme="majorHAnsi"/>
+          <w:sz w:val="20"/>
+          <w:szCs w:val="20"/>
+        </w:rPr>
+        <w:t xml:space="preserve"> </w:t>
+      </w:r>
+      <w:r>
+        <w:rPr>
+          <w:rFonts w:ascii="Altivo Light" w:hAnsi="Altivo Light" w:cstheme="majorHAnsi"/>
+          <w:sz w:val="20"/>
+          <w:szCs w:val="20"/>
+        </w:rPr>
+        <w:t>de la Unidad de Recursos Humanos de la Secretaría de Comunicación Social de la Presidencia.</w:t>
+      </w:r>
+    </w:p>
+    <w:p>
+      <w:pPr>
+        <w:jc w:val="both"/>
+        <w:rPr>
+          <w:rFonts w:asciiTheme="majorHAnsi" w:hAnsiTheme="majorHAnsi" w:cstheme="majorHAnsi"/>
+          <w:sz w:val="20"/>
+          <w:szCs w:val="20"/>
+        </w:rPr>
+      </w:pPr>
+    </w:p>
+    <w:p>
+      <w:pPr>
+        <w:jc w:val="center"/>
+        <w:rPr>
+          <w:rFonts w:ascii="Altivo Light" w:hAnsi="Altivo Light" w:cstheme="majorHAnsi"/>
+          <w:b/>
+          <w:sz w:val="20"/>
+          <w:szCs w:val="20"/>
+        </w:rPr>
+      </w:pPr>
+      <w:r>
+        <w:rPr>
+          <w:rFonts w:ascii="Altivo Light" w:hAnsi="Altivo Light" w:cstheme="majorHAnsi"/>
+          <w:b/>
+          <w:sz w:val="20"/>
+          <w:szCs w:val="20"/>
+        </w:rPr>
+        <w:t>CERTIFICA</w:t>
+      </w:r>
+    </w:p>
+    <w:p>
+      <w:pPr>
+        <w:jc w:val="center"/>
+        <w:rPr>
+          <w:rFonts w:ascii="Altivo Light" w:hAnsi="Altivo Light" w:cstheme="majorHAnsi"/>
+          <w:b/>
+          <w:sz w:val="20"/>
+          <w:szCs w:val="20"/>
+        </w:rPr>
+      </w:pPr>
+    </w:p>
+    <w:p>
+      <w:pPr>
+        <w:spacing w:line="276" w:lineRule="auto"/>
+        <w:jc w:val="both"/>
+        <w:rPr>
+          <w:rFonts w:ascii="Altivo Light" w:hAnsi="Altivo Light" w:cstheme="majorHAnsi"/>
+          <w:sz w:val="20"/>
+          <w:szCs w:val="20"/>
+        </w:rPr>
+      </w:pPr>
+      <w:r>
+        <w:rPr>
+          <w:rFonts w:ascii="Altivo Light" w:hAnsi="Altivo Light" w:cstheme="majorHAnsi"/>
+          <w:b/>
+          <w:sz w:val="20"/>
+          <w:szCs w:val="20"/>
+          <w:u w:val="single"/>
+        </w:rPr>
+        <w:t>PRIMERO</w:t>
+      </w:r>
+      <w:r>
+        <w:rPr>
+          <w:rFonts w:ascii="Altivo Light" w:hAnsi="Altivo Light" w:cstheme="majorHAnsi"/>
+          <w:sz w:val="20"/>
+          <w:szCs w:val="20"/>
+        </w:rPr>
+        <w:t xml:space="preserve">: </w:t>
+      </w:r>
+      <w:r>
+        <w:rPr>
+          <w:rFonts w:ascii="Altivo Light" w:hAnsi="Altivo Light" w:cs="Arial"/>
+          <w:sz w:val="20"/>
+          <w:szCs w:val="20"/>
+        </w:rPr>
+        <w:t>Que se ha tenido a la vista la Nómina General de Salarios del Sistema de Nómina, Registro de Servicios Personales, Estudios y/o Servicios Individuales y Otros Relacionados con el Recurso Humano -Guatenóminas-</w:t>
+      </w:r>
+      <w:r>
+        <w:rPr>
+          <w:rFonts w:ascii="Altivo Light" w:hAnsi="Altivo Light" w:cs="Arial"/>
+          <w:sz w:val="20"/>
+          <w:szCs w:val="20"/>
+        </w:rPr>
+        <w:t xml:space="preserve"> y el expediente</w:t>
+      </w:r>
+      <w:r>
+        <w:rPr>
+          <w:rFonts w:ascii="Altivo Light" w:hAnsi="Altivo Light" w:cs="Arial"/>
+          <w:sz w:val="20"/>
+          <w:szCs w:val="20"/>
+        </w:rPr>
+        <w:t xml:space="preserve"> </w:t>
+      </w:r>
+      <w:bookmarkStart w:id="0" w:name="_Hlk196232496"/>
+      <w:r>
+        <w:rPr>
+          <w:rFonts w:ascii="Altivo Light" w:hAnsi="Altivo Light" w:cstheme="majorHAnsi"/>
+          <w:sz w:val="20"/>
+          <w:szCs w:val="20"/>
+        </w:rPr>
+        <w:t>de</w:t>
+      </w:r>
+      <w:r>
+        <w:rPr>
+          <w:rFonts w:ascii="Altivo Light" w:hAnsi="Altivo Light" w:cstheme="majorHAnsi"/>
+          <w:sz w:val="20"/>
+          <w:szCs w:val="20"/>
+        </w:rPr>
+        <w:t xml:space="preserve"> </w:t>
+      </w:r>
+      <w:r>
+        <w:rPr>
+          <w:rFonts w:ascii="Altivo Light" w:hAnsi="Altivo Light" w:cs="Arial"/>
+          <w:sz w:val="20"/>
+          <w:szCs w:val="20"/>
+        </w:rPr>
+        <w:t xml:space="preserve">[el/la] [señor/señora/Licenciado/Licenciada] </w:t>
+      </w:r>
+      <w:r>
+        <w:rPr>
+          <w:rFonts w:ascii="Altivo Light" w:hAnsi="Altivo Light" w:cs="Arial"/>
+          <w:b/>
+          <w:bCs/>
+          <w:sz w:val="20"/>
+          <w:szCs w:val="20"/>
+        </w:rPr>
+        <w:t>[NOMBRE COMPLETO]</w:t>
+      </w:r>
+      <w:r>
+        <w:rPr>
+          <w:rFonts w:ascii="Altivo Light" w:hAnsi="Altivo Light" w:cs="Arial"/>
+          <w:sz w:val="20"/>
+          <w:szCs w:val="20"/>
+        </w:rPr>
+        <w:t>,</w:t>
+      </w:r>
+      <w:r>
+        <w:rPr>
+          <w:rFonts w:ascii="Altivo Light" w:hAnsi="Altivo Light" w:cstheme="majorHAnsi"/>
+          <w:b/>
+          <w:bCs/>
+          <w:sz w:val="20"/>
+          <w:szCs w:val="20"/>
+        </w:rPr>
+        <w:t xml:space="preserve"> </w:t>
+      </w:r>
+      <w:bookmarkEnd w:id="0"/>
+      <w:r>
+        <w:rPr>
+          <w:rFonts w:ascii="Altivo Light" w:hAnsi="Altivo Light" w:cstheme="majorHAnsi"/>
+          <w:sz w:val="20"/>
+          <w:szCs w:val="20"/>
+        </w:rPr>
+        <w:t>quien se identifica con Documento Personal de Identificación -DPI- con Código Único de Identificación -CUI-</w:t>
+      </w:r>
+      <w:r>
+        <w:rPr>
+          <w:rFonts w:ascii="Altivo Light" w:hAnsi="Altivo Light" w:cstheme="majorHAnsi"/>
+          <w:sz w:val="20"/>
+          <w:szCs w:val="20"/>
+        </w:rPr>
+        <w:t xml:space="preserve"> </w:t>
+      </w:r>
+      <w:r>
+        <w:rPr>
+          <w:rFonts w:ascii="Altivo Light" w:hAnsi="Altivo Light" w:cstheme="majorHAnsi"/>
+          <w:sz w:val="20"/>
+          <w:szCs w:val="20"/>
+        </w:rPr>
+        <w:t>[CUI]</w:t>
+      </w:r>
+      <w:r>
+        <w:rPr>
+          <w:rFonts w:ascii="Altivo Light" w:hAnsi="Altivo Light" w:cstheme="majorHAnsi"/>
+          <w:sz w:val="20"/>
+          <w:szCs w:val="20"/>
+        </w:rPr>
+        <w:t>.</w:t>
+      </w:r>
+      <w:r>
+        <w:rPr>
+          <w:rFonts w:ascii="Altivo Light" w:hAnsi="Altivo Light" w:cstheme="majorHAnsi"/>
+          <w:sz w:val="20"/>
+          <w:szCs w:val="20"/>
+        </w:rPr>
+        <w:t xml:space="preserve"> </w:t>
+      </w:r>
+    </w:p>
+    <w:p>
+      <w:pPr>
+        <w:jc w:val="both"/>
+        <w:rPr>
+          <w:rFonts w:ascii="Altivo Light" w:hAnsi="Altivo Light" w:cs="Arial"/>
+          <w:sz w:val="20"/>
+          <w:szCs w:val="20"/>
+        </w:rPr>
+      </w:pPr>
+    </w:p>
+    <w:p>
+      <w:pPr>
+        <w:spacing w:line="276" w:lineRule="auto"/>
+        <w:jc w:val="both"/>
+        <w:rPr>
+          <w:rFonts w:ascii="Altivo Light" w:hAnsi="Altivo Light" w:cstheme="majorHAnsi"/>
+          <w:sz w:val="20"/>
+          <w:szCs w:val="20"/>
+        </w:rPr>
+      </w:pPr>
+      <w:r>
+        <w:rPr>
+          <w:rFonts w:ascii="Altivo Light" w:hAnsi="Altivo Light" w:cstheme="majorHAnsi"/>
+          <w:b/>
+          <w:sz w:val="20"/>
+          <w:szCs w:val="20"/>
+          <w:u w:val="single"/>
+        </w:rPr>
+        <w:t>SEGUNDO</w:t>
+      </w:r>
+      <w:r>
+        <w:rPr>
+          <w:rFonts w:ascii="Altivo Light" w:hAnsi="Altivo Light" w:cstheme="majorHAnsi"/>
+          <w:sz w:val="20"/>
+          <w:szCs w:val="20"/>
+        </w:rPr>
+        <w:t xml:space="preserve">: [El/La] [señor/señora/Licenciado/Licenciada] </w:t>
+      </w:r>
+      <w:r>
+        <w:rPr>
+          <w:rFonts w:ascii="Altivo Light" w:hAnsi="Altivo Light" w:cstheme="majorHAnsi"/>
+          <w:b/>
+          <w:bCs/>
+          <w:sz w:val="20"/>
+          <w:szCs w:val="20"/>
+        </w:rPr>
+        <w:t>[NOMBRE COMPLETO]</w:t>
+      </w:r>
+      <w:r>
+        <w:rPr>
+          <w:rFonts w:ascii="Altivo Light" w:hAnsi="Altivo Light" w:cstheme="majorHAnsi"/>
+          <w:sz w:val="20"/>
+          <w:szCs w:val="20"/>
+        </w:rPr>
+        <w:t xml:space="preserve">, labora en esta Secretaría a partir del [DÍA EN LETRAS] ([DD]) de [MES] del año [AÑO EN LETRAS] ([AAAA]), ocupando actualmente el puesto nominal de </w:t>
+      </w:r>
+      <w:r>
+        <w:rPr>
+          <w:rFonts w:ascii="Altivo Light" w:hAnsi="Altivo Light" w:cstheme="majorHAnsi"/>
+          <w:b/>
+          <w:bCs/>
+          <w:sz w:val="20"/>
+          <w:szCs w:val="20"/>
+        </w:rPr>
+        <w:t>[PUESTO NOMINAL]</w:t>
+      </w:r>
+      <w:r>
+        <w:rPr>
+          <w:rFonts w:ascii="Altivo Light" w:hAnsi="Altivo Light" w:cstheme="majorHAnsi"/>
+          <w:sz w:val="20"/>
+          <w:szCs w:val="20"/>
+        </w:rPr>
+        <w:t xml:space="preserve">, con cargo al renglón presupuestario [RENGLÓN] “[NOMBRE DEL RENGLÓN]” y con un salario mensual de [SALARIO EN LETRAS] (Q.[SALARIO EN NÚMEROS]).</w:t>
+      </w:r>
+    </w:p>
+    <w:p>
+      <w:pPr>
+        <w:spacing w:line="276" w:lineRule="auto"/>
+        <w:jc w:val="both"/>
+        <w:rPr>
+          <w:rFonts w:ascii="Altivo Light" w:hAnsi="Altivo Light" w:cstheme="majorHAnsi"/>
+          <w:sz w:val="20"/>
+          <w:szCs w:val="20"/>
+        </w:rPr>
+      </w:pPr>
+    </w:p>
+    <w:p>
+      <w:pPr>
+        <w:spacing w:line="276" w:lineRule="auto"/>
+        <w:jc w:val="both"/>
+        <w:rPr>
+          <w:rFonts w:ascii="Altivo Light" w:hAnsi="Altivo Light" w:cstheme="majorHAnsi"/>
+          <w:sz w:val="20"/>
+          <w:szCs w:val="20"/>
+        </w:rPr>
+      </w:pPr>
+    </w:p>
+    <w:p>
+      <w:pPr>
+        <w:spacing w:line="276" w:lineRule="auto"/>
+        <w:jc w:val="both"/>
+        <w:rPr>
+          <w:rFonts w:ascii="Altivo Light" w:hAnsi="Altivo Light" w:cstheme="majorHAnsi"/>
+          <w:sz w:val="20"/>
+          <w:szCs w:val="20"/>
+        </w:rPr>
+      </w:pPr>
+      <w:bookmarkStart w:id="1" w:name="_Hlk206082943"/>
+      <w:r>
+        <w:rPr>
+          <w:rFonts w:ascii="Altivo Light" w:hAnsi="Altivo Light" w:cstheme="majorHAnsi"/>
+          <w:sz w:val="20"/>
+          <w:szCs w:val="20"/>
+        </w:rPr>
+        <w:t>Y para los usos administrativos</w:t>
+      </w:r>
+      <w:bookmarkEnd w:id="1"/>
+      <w:r>
+        <w:rPr>
+          <w:rFonts w:ascii="Altivo Light" w:hAnsi="Altivo Light" w:cstheme="majorHAnsi"/>
+          <w:sz w:val="20"/>
+          <w:szCs w:val="20"/>
+        </w:rPr>
+        <w:t>, que la parte interesada convenga se extiende, firma y sella la presente constancia en una hoja de papel membretado de esta Secretaría, en la ciudad de Guatemala a los</w:t>
+      </w:r>
+      <w:r>
+        <w:rPr>
+          <w:rFonts w:ascii="Altivo Light" w:hAnsi="Altivo Light" w:cstheme="majorHAnsi"/>
+          <w:sz w:val="20"/>
+          <w:szCs w:val="20"/>
+        </w:rPr>
+        <w:t xml:space="preserve"> </w:t>
+      </w:r>
+      <w:r>
+        <w:rPr>
+          <w:rFonts w:ascii="Altivo Light" w:hAnsi="Altivo Light" w:cstheme="majorHAnsi"/>
+          <w:sz w:val="20"/>
+          <w:szCs w:val="20"/>
+        </w:rPr>
+        <w:t>[DÍA EN LETRAS] ([DD]) días del mes de [MES] del [AÑO EN LETRAS] ([AAAA])</w:t>
+      </w:r>
+      <w:r>
+        <w:rPr>
+          <w:rFonts w:ascii="Altivo Light" w:hAnsi="Altivo Light" w:cstheme="majorHAnsi"/>
+          <w:sz w:val="20"/>
+          <w:szCs w:val="20"/>
+        </w:rPr>
+        <w:t>.</w:t>
+      </w:r>
+    </w:p>
+    <w:p>
+      <w:pPr>
+        <w:spacing w:line="276" w:lineRule="auto"/>
+        <w:jc w:val="both"/>
+        <w:rPr>
+          <w:rFonts w:ascii="Altivo Light" w:hAnsi="Altivo Light" w:cstheme="majorHAnsi"/>
           <w:sz w:val="22"/>
           <w:szCs w:val="22"/>
         </w:rPr>
-        <w:t>SCSP/URH/[CORRELATIVO]-[AÑO]/[INICIALES] de [MES] del año [AÑO EN LETRAS] ([AAAA]), ocupando actualmente el puesto nominal de </w:t>
-      </w:r>
-      <w:r>
-        <w:rPr>
-          <w:rFonts w:ascii="Altivo Light" w:hAnsi="Altivo Light" w:cstheme="majorHAnsi"/>
-          <w:b/>
-          <w:bCs/>
+      </w:pPr>
+    </w:p>
+    <w:p>
+      <w:pPr>
+        <w:spacing w:line="276" w:lineRule="auto"/>
+        <w:jc w:val="both"/>
+        <w:rPr>
+          <w:rFonts w:ascii="Altivo Light" w:hAnsi="Altivo Light" w:cstheme="majorHAnsi"/>
           <w:sz w:val="22"/>
           <w:szCs w:val="22"/>
         </w:rPr>
-        <w:t xml:space="preserve">[PUESTO NOMINAL], </w:t>
-      </w:r>
-      <w:r>
-        <w:rPr>
-          <w:rFonts w:ascii="Altivo Light" w:hAnsi="Altivo Light" w:cstheme="majorHAnsi"/>
+      </w:pPr>
+      <w:r>
+        <w:rPr>
+          <w:rFonts w:ascii="Altivo Light" w:hAnsi="Altivo Light" w:cstheme="majorHAnsi"/>
+          <w:noProof/>
           <w:sz w:val="22"/>
           <w:szCs w:val="22"/>
         </w:rPr>
-        <w:t>con cargo al renglón presupuestario [RENGLÓN] “[NOMBRE DEL RENGLÓN]” y con un salario mensual de [SALARIO EN LETRAS] (</w:t>
-      </w:r>
-      <w:proofErr w:type="gramStart"/>
-      <w:r>
-        <w:rPr>
-          <w:rFonts w:ascii="Altivo Light" w:hAnsi="Altivo Light" w:cstheme="majorHAnsi"/>
+        <mc:AlternateContent>
+          <mc:Choice Requires="wps">
+            <w:drawing>
+              <wp:anchor distT="0" distB="0" distL="114300" distR="114300" simplePos="0" relativeHeight="251659264" behindDoc="0" locked="0" layoutInCell="1" allowOverlap="1" wp14:anchorId="53A9A7A7" wp14:editId="658100F9">
+                <wp:simplePos x="0" y="0"/>
+                <wp:positionH relativeFrom="column">
+                  <wp:posOffset>3155366</wp:posOffset>
+                </wp:positionH>
+                <wp:positionV relativeFrom="paragraph">
+                  <wp:posOffset>31775</wp:posOffset>
+                </wp:positionV>
+                <wp:extent cx="1309421" cy="248717"/>
+                <wp:effectExtent l="0" t="0" r="0" b="0"/>
+                <wp:wrapNone/>
+                <wp:docPr id="1541830273" name="Cuadro de texto 1"/>
+                <wp:cNvGraphicFramePr/>
+                <a:graphic xmlns:a="http://schemas.openxmlformats.org/drawingml/2006/main">
+                  <a:graphicData uri="http://schemas.microsoft.com/office/word/2010/wordprocessingShape">
+                    <wps:wsp>
+                      <wps:cNvSpPr txBox="1"/>
+                      <wps:spPr>
+                        <a:xfrm>
+                          <a:off x="0" y="0"/>
+                          <a:ext cx="1309421" cy="248717"/>
+                        </a:xfrm>
+                        <a:prstGeom prst="rect">
+                          <a:avLst/>
+                        </a:prstGeom>
+                        <a:noFill/>
+                        <a:ln w="6350">
+                          <a:noFill/>
+                        </a:ln>
+                      </wps:spPr>
+                      <wps:txbx>
+                        <w:txbxContent>
+                          <w:p>
+                            <w:pPr>
+                              <w:rPr>
+                                <w:sz w:val="16"/>
+                                <w:szCs w:val="16"/>
+                                <w:lang w:val="es-ES"/>
+                              </w:rPr>
+                            </w:pPr>
+                            <w:proofErr w:type="spellStart"/>
+                            <w:proofErr w:type="gramStart"/>
+                            <w:r>
+                              <w:rPr>
+                                <w:sz w:val="16"/>
+                                <w:szCs w:val="16"/>
+                                <w:lang w:val="es-ES"/>
+                              </w:rPr>
+                              <w:t>Vo.Bo</w:t>
+                            </w:r>
+                            <w:proofErr w:type="spellEnd"/>
+                            <w:proofErr w:type="gramEnd"/>
+                          </w:p>
+                        </w:txbxContent>
+                      </wps:txbx>
+                      <wps:bodyPr rot="0" spcFirstLastPara="0" vertOverflow="overflow" horzOverflow="overflow" vert="horz" wrap="square" lIns="91440" tIns="45720" rIns="91440" bIns="45720" numCol="1" spcCol="0" rtlCol="0" fromWordArt="0" anchor="t" anchorCtr="0" forceAA="0" compatLnSpc="1">
+                        <a:prstTxWarp prst="textNoShape">
+                          <a:avLst/>
+                        </a:prstTxWarp>
+                        <a:noAutofit/>
+                      </wps:bodyPr>
+                    </wps:wsp>
+                  </a:graphicData>
+                </a:graphic>
+              </wp:anchor>
+            </w:drawing>
+          </mc:Choice>
+          <mc:Fallback>
+            <w:pict>
+              <v:shapetype w14:anchorId="53A9A7A7" id="_x0000_t202" coordsize="21600,21600" o:spt="202" path="m,l,21600r21600,l21600,xe">
+                <v:stroke joinstyle="miter"/>
+                <v:path gradientshapeok="t" o:connecttype="rect"/>
+              </v:shapetype>
+              <v:shape id="Cuadro de texto 1" o:spid="_x0000_s1026" type="#_x0000_t202" style="position:absolute;left:0;text-align:left;margin-left:248.45pt;margin-top:2.5pt;width:103.1pt;height:19.6pt;z-index:251659264;visibility:visible;mso-wrap-style:square;mso-wrap-distance-left:9pt;mso-wrap-distance-top:0;mso-wrap-distance-right:9pt;mso-wrap-distance-bottom:0;mso-position-horizontal:absolute;mso-position-horizontal-relative:text;mso-position-vertical:absolute;mso-position-vertical-relative:text;v-text-anchor:top" o:gfxdata="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" filled="f" stroked="f" strokeweight=".5pt">
+                <v:textbox>
+                  <w:txbxContent>
+                    <w:p>
+                      <w:pPr>
+                        <w:rPr>
+                          <w:sz w:val="16"/>
+                          <w:szCs w:val="16"/>
+                          <w:lang w:val="es-ES"/>
+                        </w:rPr>
+                      </w:pPr>
+                      <w:proofErr w:type="spellStart"/>
+                      <w:proofErr w:type="gramStart"/>
+                      <w:r>
+                        <w:rPr>
+                          <w:sz w:val="16"/>
+                          <w:szCs w:val="16"/>
+                          <w:lang w:val="es-ES"/>
+                        </w:rPr>
+                        <w:t>Vo.Bo</w:t>
+                      </w:r>
+                      <w:proofErr w:type="spellEnd"/>
+                      <w:proofErr w:type="gramEnd"/>
+                    </w:p>
+                  </w:txbxContent>
+                </v:textbox>
+              </v:shape>
+            </w:pict>
+          </mc:Fallback>
+        </mc:AlternateContent>
+      </w:r>
+    </w:p>
+    <w:p>
+      <w:pPr>
+        <w:spacing w:line="276" w:lineRule="auto"/>
+        <w:jc w:val="both"/>
+        <w:rPr>
+          <w:rFonts w:ascii="Altivo Light" w:hAnsi="Altivo Light"/>
           <w:sz w:val="22"/>
           <w:szCs w:val="22"/>
         </w:rPr>
-        <w:t>Q.[</w:t>
-      </w:r>
-      <w:proofErr w:type="gramEnd"/>
-      <w:r>
-        <w:rPr>
-          <w:rFonts w:ascii="Altivo Light" w:hAnsi="Altivo Light" w:cstheme="majorHAnsi"/>
-          <w:sz w:val="22"/>
-          <w:szCs w:val="22"/>
-        </w:rPr>
-        <w:t>SALARIO EN NÚMEROS]).</w:t>
-      </w:r>
+      </w:pPr>
     </w:p>
     <w:p>
       <w:pPr>
         <w:spacing w:line="276" w:lineRule="auto"/>
         <w:jc w:val="both"/>
         <w:rPr>
-          <w:rFonts w:ascii="Altivo Light" w:hAnsi="Altivo Light" w:cstheme="majorHAnsi"/>
-          <w:sz w:val="22"/>
-          <w:szCs w:val="22"/>
-        </w:rPr>
-      </w:pPr>
-    </w:p>
-    <w:p>
-      <w:pPr>
-        <w:spacing w:line="276" w:lineRule="auto"/>
-        <w:jc w:val="both"/>
-        <w:rPr>
-          <w:rFonts w:ascii="Altivo Light" w:hAnsi="Altivo Light" w:cstheme="majorHAnsi"/>
-          <w:sz w:val="22"/>
-          <w:szCs w:val="22"/>
-        </w:rPr>
-      </w:pPr>
-      <w:bookmarkStart w:id="1" w:name="_Hlk206082943"/>
-      <w:r>
-        <w:rPr>
-          <w:rFonts w:ascii="Altivo Light" w:hAnsi="Altivo Light" w:cstheme="majorHAnsi"/>
-          <w:sz w:val="22"/>
-          <w:szCs w:val="22"/>
-        </w:rPr>
-        <w:t>Y para los usos administrativos</w:t>
-      </w:r>
-      <w:bookmarkEnd w:id="1"/>
-      <w:r>
-        <w:rPr>
-          <w:rFonts w:ascii="Altivo Light" w:hAnsi="Altivo Light" w:cstheme="majorHAnsi"/>
-          <w:sz w:val="22"/>
-          <w:szCs w:val="22"/>
-        </w:rPr>
-        <w:t>, que la parte interesada convenga se extiende, firma y sella la presente constancia en una hoja de papel membretado de esta Secretaría, en la ciudad de Guatemala a los [DÍA EN LETRAS] ([DD]) días del mes de [MES] del [AÑO EN LETRAS] ([AAAA]).</w:t>
-      </w:r>
-    </w:p>
-    <w:p>
-      <w:pPr>
-        <w:spacing w:line="276" w:lineRule="auto"/>
-        <w:jc w:val="both"/>
-        <w:rPr>
-          <w:rFonts w:ascii="Altivo Light" w:hAnsi="Altivo Light" w:cstheme="majorHAnsi"/>
-          <w:sz w:val="22"/>
-          <w:szCs w:val="22"/>
-        </w:rPr>
-      </w:pPr>
-    </w:p>
-    <w:p>
-      <w:pPr>
-        <w:spacing w:line="276" w:lineRule="auto"/>
-        <w:jc w:val="both"/>
-        <w:rPr>
-          <w:rFonts w:ascii="Altivo Light" w:hAnsi="Altivo Light" w:cstheme="majorHAnsi"/>
-          <w:sz w:val="22"/>
-          <w:szCs w:val="22"/>
-        </w:rPr>
-      </w:pPr>
-    </w:p>
-    <w:p>
-      <w:pPr>
-        <w:rPr>
           <w:rFonts w:asciiTheme="majorHAnsi" w:hAnsiTheme="majorHAnsi" w:cstheme="majorHAnsi"/>
         </w:rPr>
       </w:pPr>
@@ -174,73 +652,37 @@
           <w:rFonts w:asciiTheme="majorHAnsi" w:hAnsiTheme="majorHAnsi" w:cstheme="majorHAnsi"/>
         </w:rPr>
       </w:pPr>
-    </w:p>
-    <w:p>
-      <w:pPr>
+      <w:proofErr w:type="spellStart"/>
+      <w:r>
         <w:rPr>
           <w:rFonts w:asciiTheme="majorHAnsi" w:hAnsiTheme="majorHAnsi" w:cstheme="majorHAnsi"/>
-        </w:rPr>
-      </w:pPr>
-    </w:p>
-    <w:p>
-      <w:pPr>
+          <w:sz w:val="20"/>
+          <w:szCs w:val="20"/>
+        </w:rPr>
+        <w:t>Cc.</w:t>
+      </w:r>
+      <w:proofErr w:type="spellEnd"/>
+      <w:r>
         <w:rPr>
           <w:rFonts w:asciiTheme="majorHAnsi" w:hAnsiTheme="majorHAnsi" w:cstheme="majorHAnsi"/>
-        </w:rPr>
-      </w:pPr>
-    </w:p>
-    <w:p>
-      <w:pPr>
+          <w:sz w:val="20"/>
+          <w:szCs w:val="20"/>
+        </w:rPr>
+        <w:t xml:space="preserve"> </w:t>
+      </w:r>
+      <w:r>
         <w:rPr>
           <w:rFonts w:asciiTheme="majorHAnsi" w:hAnsiTheme="majorHAnsi" w:cstheme="majorHAnsi"/>
-        </w:rPr>
-      </w:pPr>
-    </w:p>
-    <w:p>
-      <w:pPr>
-        <w:rPr>
-          <w:rFonts w:asciiTheme="majorHAnsi" w:hAnsiTheme="majorHAnsi" w:cstheme="majorHAnsi"/>
-        </w:rPr>
-      </w:pPr>
-    </w:p>
-    <w:p>
-      <w:pPr>
-        <w:rPr>
-          <w:rFonts w:asciiTheme="majorHAnsi" w:hAnsiTheme="majorHAnsi" w:cstheme="majorHAnsi"/>
-          <w:sz w:val="14"/>
-          <w:szCs w:val="14"/>
-        </w:rPr>
-      </w:pPr>
-      <w:r>
-        <w:rPr>
-          <w:rFonts w:asciiTheme="majorHAnsi" w:hAnsiTheme="majorHAnsi" w:cstheme="majorHAnsi"/>
-          <w:sz w:val="14"/>
-          <w:szCs w:val="14"/>
-        </w:rPr>
-        <w:t>C.c. Archivo</w:t>
-      </w:r>
-    </w:p>
-    <w:p>
-      <w:pPr>
-        <w:rPr>
-          <w:rFonts w:asciiTheme="majorHAnsi" w:hAnsiTheme="majorHAnsi" w:cstheme="majorHAnsi"/>
-          <w:sz w:val="14"/>
-          <w:szCs w:val="14"/>
-        </w:rPr>
-      </w:pPr>
-      <w:r>
-        <w:rPr>
-          <w:rFonts w:asciiTheme="majorHAnsi" w:hAnsiTheme="majorHAnsi" w:cstheme="majorHAnsi"/>
-          <w:sz w:val="14"/>
-          <w:szCs w:val="14"/>
-        </w:rPr>
-        <w:t>Expediente Personal</w:t>
+          <w:sz w:val="20"/>
+          <w:szCs w:val="20"/>
+        </w:rPr>
+        <w:t>Archivo</w:t>
       </w:r>
     </w:p>
     <w:sectPr>
       <w:headerReference w:type="default" r:id="rId7"/>
       <w:pgSz w:w="12240" w:h="15840" w:code="1"/>
-      <w:pgMar w:top="2155" w:right="1701" w:bottom="1418" w:left="1701" w:header="397" w:footer="709" w:gutter="0"/>
+      <w:pgMar w:top="1843" w:right="1701" w:bottom="1276" w:left="1701" w:header="397" w:footer="709" w:gutter="0"/>
       <w:cols w:space="708"/>
       <w:docGrid w:linePitch="360"/>
     </w:sectPr>
@@ -302,18 +744,18 @@
         <w:noProof/>
       </w:rPr>
       <w:drawing>
-        <wp:anchor distT="0" distB="0" distL="114300" distR="114300" simplePos="0" relativeHeight="251659264" behindDoc="1" locked="0" layoutInCell="1" allowOverlap="1" wp14:anchorId="001350E8" wp14:editId="2004A399">
+        <wp:anchor distT="0" distB="0" distL="114300" distR="114300" simplePos="0" relativeHeight="251659264" behindDoc="1" locked="0" layoutInCell="1" allowOverlap="1" wp14:anchorId="47A6A4EF" wp14:editId="747CCE82">
           <wp:simplePos x="0" y="0"/>
           <wp:positionH relativeFrom="page">
-            <wp:align>left</wp:align>
+            <wp:posOffset>30736</wp:posOffset>
           </wp:positionH>
           <wp:positionV relativeFrom="paragraph">
-            <wp:posOffset>-247650</wp:posOffset>
+            <wp:posOffset>-252095</wp:posOffset>
           </wp:positionV>
-          <wp:extent cx="7855177" cy="10165524"/>
-          <wp:effectExtent l="0" t="0" r="0" b="7620"/>
+          <wp:extent cx="7683500" cy="10050716"/>
+          <wp:effectExtent l="0" t="0" r="0" b="8255"/>
           <wp:wrapNone/>
-          <wp:docPr id="1717863848" name="Imagen 1"/>
+          <wp:docPr id="755257326" name="Imagen 1"/>
           <wp:cNvGraphicFramePr>
             <a:graphicFrameLocks xmlns:a="http://schemas.openxmlformats.org/drawingml/2006/main" noChangeAspect="1"/>
           </wp:cNvGraphicFramePr>
@@ -321,8 +763,10 @@
             <a:graphicData uri="http://schemas.openxmlformats.org/drawingml/2006/picture">
               <pic:pic xmlns:pic="http://schemas.openxmlformats.org/drawingml/2006/picture">
                 <pic:nvPicPr>
-                  <pic:cNvPr id="1717863848" name="Imagen 1"/>
-                  <pic:cNvPicPr/>
+                  <pic:cNvPr id="0" name="Imagen 1"/>
+                  <pic:cNvPicPr>
+                    <a:picLocks noChangeAspect="1" noChangeArrowheads="1"/>
+                  </pic:cNvPicPr>
                 </pic:nvPicPr>
                 <pic:blipFill>
                   <a:blip r:embed="rId1">
@@ -332,18 +776,20 @@
                       </a:ext>
                     </a:extLst>
                   </a:blip>
+                  <a:srcRect/>
                   <a:stretch>
                     <a:fillRect/>
                   </a:stretch>
                 </pic:blipFill>
-                <pic:spPr>
+                <pic:spPr bwMode="auto">
                   <a:xfrm>
                     <a:off x="0" y="0"/>
-                    <a:ext cx="7855177" cy="10165524"/>
+                    <a:ext cx="7689214" cy="10058190"/>
                   </a:xfrm>
                   <a:prstGeom prst="rect">
                     <a:avLst/>
                   </a:prstGeom>
+                  <a:noFill/>
                 </pic:spPr>
               </pic:pic>
             </a:graphicData>
@@ -356,6 +802,9 @@
           </wp14:sizeRelV>
         </wp:anchor>
       </w:drawing>
+    </w:r>
+    <w:r>
+      <w:tab/>
     </w:r>
   </w:p>
 </w:hdr>

</xml_diff>